<commit_message>
validácios frissitések, dokumentácio bövitése
</commit_message>
<xml_diff>
--- a/Documents/BackendFejlesztoi.docx
+++ b/Documents/BackendFejlesztoi.docx
@@ -1295,16 +1295,28 @@
         <w:t>"nev":"", ##Muszály</w:t>
       </w:r>
       <w:r>
+        <w:t xml:space="preserve"> szöveg, 255 max hossz, 1 minimum hossz</w:t>
+      </w:r>
+      <w:r>
         <w:br/>
         <w:t>"email":"", ##Muszály</w:t>
       </w:r>
       <w:r>
+        <w:t xml:space="preserve"> szöveg, emailenként 1 felhasználo.</w:t>
+      </w:r>
+      <w:r>
         <w:br/>
         <w:t>"password":"", ##Muszály</w:t>
       </w:r>
       <w:r>
+        <w:t xml:space="preserve"> szöveg, 8 minimum hossz</w:t>
+      </w:r>
+      <w:r>
         <w:br/>
         <w:t>"password_confirmation":"" ##Muszály</w:t>
+      </w:r>
+      <w:r>
+        <w:t xml:space="preserve"> ugyan az mint a password</w:t>
       </w:r>
       <w:r>
         <w:br/>
@@ -1349,8 +1361,14 @@
         <w:t>"email":"", ##Muszály</w:t>
       </w:r>
       <w:r>
+        <w:t xml:space="preserve"> email</w:t>
+      </w:r>
+      <w:r>
         <w:br/>
         <w:t>"password":"" ##Muszály</w:t>
+      </w:r>
+      <w:r>
+        <w:t xml:space="preserve"> szöveg, minimum 8, felhasználó jelszava</w:t>
       </w:r>
       <w:r>
         <w:br/>
@@ -1396,10 +1414,16 @@
         <w:t>"csoport_tipus_id":"", ##Muszály</w:t>
       </w:r>
       <w:r>
+        <w:t xml:space="preserve"> szám, létezö csoport tipus id</w:t>
+      </w:r>
+      <w:r>
         <w:br/>
         <w:t>"megnevezes":"" ##Muszály</w:t>
       </w:r>
       <w:r>
+        <w:t xml:space="preserve"> szöveg, 1 minimum hossz</w:t>
+      </w:r>
+      <w:r>
         <w:br/>
         <w:t>}</w:t>
       </w:r>
@@ -1445,10 +1469,22 @@
         <w:t>"contactTipusId":"", ##Muszály</w:t>
       </w:r>
       <w:r>
+        <w:t xml:space="preserve"> szám,</w:t>
+      </w:r>
+      <w:r>
+        <w:t xml:space="preserve"> létezö contact tipus id</w:t>
+      </w:r>
+      <w:r>
         <w:br/>
         <w:t>"text":"" ##Muszály</w:t>
       </w:r>
       <w:r>
+        <w:t xml:space="preserve"> szöveg,</w:t>
+      </w:r>
+      <w:r>
+        <w:t xml:space="preserve"> 1 minimum hossz</w:t>
+      </w:r>
+      <w:r>
         <w:br/>
         <w:t>}</w:t>
       </w:r>
@@ -1499,8 +1535,20 @@
         <w:t>"csoport_id":"", ##Muszály</w:t>
       </w:r>
       <w:r>
+        <w:t xml:space="preserve"> szám,</w:t>
+      </w:r>
+      <w:r>
+        <w:t xml:space="preserve"> létezö csoport id</w:t>
+      </w:r>
+      <w:r>
         <w:br/>
         <w:t>"felhasznalo_id":"" ##Muszály</w:t>
+      </w:r>
+      <w:r>
+        <w:t xml:space="preserve"> szám,</w:t>
+      </w:r>
+      <w:r>
+        <w:t xml:space="preserve"> létezö felhasználo id</w:t>
       </w:r>
       <w:r>
         <w:br/>
@@ -1554,26 +1602,53 @@
         <w:t>"kezdesi_datum":"", ##Muszály</w:t>
       </w:r>
       <w:r>
+        <w:t xml:space="preserve"> dátum</w:t>
+      </w:r>
+      <w:r>
         <w:br/>
         <w:t>"lejarasi_datum":"", ##Muszály</w:t>
       </w:r>
       <w:r>
+        <w:t xml:space="preserve"> dátum </w:t>
+      </w:r>
+      <w:r>
         <w:br/>
         <w:t>"kod":"", ##Muszály</w:t>
       </w:r>
       <w:r>
+        <w:t xml:space="preserve"> szöveg, 1 minimum hossz</w:t>
+      </w:r>
+      <w:r>
         <w:br/>
         <w:t>"kedvezmeny":"", ##Muszály</w:t>
       </w:r>
       <w:r>
+        <w:t xml:space="preserve"> szöveg,</w:t>
+      </w:r>
+      <w:r>
+        <w:t xml:space="preserve"> 1 minimum hossz</w:t>
+      </w:r>
+      <w:r>
         <w:br/>
         <w:t xml:space="preserve">"megjegyzes":"", </w:t>
       </w:r>
       <w:r>
+        <w:t xml:space="preserve"> ##szöveg</w:t>
+      </w:r>
+      <w:r>
+        <w:t>, 1 minimum hossz</w:t>
+      </w:r>
+      <w:r>
         <w:br/>
         <w:t>"hasznalasi_hely":"" ##Muszály</w:t>
       </w:r>
       <w:r>
+        <w:t xml:space="preserve"> szöveg, 1 minimum hossz</w:t>
+      </w:r>
+      <w:r>
+        <w:tab/>
+      </w:r>
+      <w:r>
         <w:br/>
         <w:t>}</w:t>
       </w:r>
@@ -1619,22 +1694,37 @@
         <w:t>"veves_lista_id":"", ##Muszály</w:t>
       </w:r>
       <w:r>
+        <w:t xml:space="preserve"> szám, létezö vevési lista id</w:t>
+      </w:r>
+      <w:r>
         <w:br/>
         <w:t>"alKategoria_id":"", ##Muszály</w:t>
       </w:r>
       <w:r>
+        <w:t xml:space="preserve"> szám, létezö alkategoria id</w:t>
+      </w:r>
+      <w:r>
         <w:br/>
         <w:t>"megnevezes":"",</w:t>
       </w:r>
       <w:r>
+        <w:t xml:space="preserve"> ##szöveg, 1 minimum hossz</w:t>
+      </w:r>
+      <w:r>
         <w:br/>
         <w:t>"ar":"", ##Muszály</w:t>
       </w:r>
       <w:r>
+        <w:t xml:space="preserve"> szám, minimum 0 </w:t>
+      </w:r>
+      <w:r>
         <w:br/>
         <w:t>"mennyiseg":"" ##Muszály</w:t>
       </w:r>
       <w:r>
+        <w:t xml:space="preserve"> szám, minimum 0</w:t>
+      </w:r>
+      <w:r>
         <w:br/>
         <w:t>}</w:t>
       </w:r>
@@ -1680,8 +1770,27 @@
         <w:t>"felhasznalo_id":"", ##Muszály</w:t>
       </w:r>
       <w:r>
+        <w:t xml:space="preserve"> szám, létezö felhasználó id</w:t>
+      </w:r>
+      <w:r>
         <w:br/>
         <w:t>"csoport_id":""</w:t>
+      </w:r>
+      <w:r>
+        <w:t xml:space="preserve"> ##szám, létezö csoport id</w:t>
+      </w:r>
+      <w:r>
+        <w:br/>
+        <w:t>"</w:t>
+      </w:r>
+      <w:r>
+        <w:t>megnevezes</w:t>
+      </w:r>
+      <w:r>
+        <w:t>":"", ##Muszály</w:t>
+      </w:r>
+      <w:r>
+        <w:t xml:space="preserve"> szöveg, 1 minimum hossz</w:t>
       </w:r>
       <w:r>
         <w:br/>
@@ -1764,13 +1873,13 @@
       </w:r>
       <w:r>
         <w:br/>
+      </w:r>
+      <w:r>
+        <w:lastRenderedPageBreak/>
         <w:t>"profilkep_url":"",</w:t>
       </w:r>
       <w:r>
         <w:br/>
-      </w:r>
-      <w:r>
-        <w:lastRenderedPageBreak/>
         <w:t>"kuponok":"",</w:t>
       </w:r>
       <w:r>
@@ -1899,6 +2008,13 @@
       <w:r>
         <w:br/>
         <w:t>}</w:t>
+      </w:r>
+      <w:r>
+        <w:br/>
+        <w:t xml:space="preserve">-- Controllere: </w:t>
+      </w:r>
+      <w:r>
+        <w:t>CsoportTagsagController</w:t>
       </w:r>
     </w:p>
     <w:p/>
@@ -1955,6 +2071,13 @@
         <w:br/>
         <w:t>}</w:t>
       </w:r>
+      <w:r>
+        <w:br/>
+        <w:t xml:space="preserve">-- Controllere: </w:t>
+      </w:r>
+      <w:r>
+        <w:t>VevesObjektumController</w:t>
+      </w:r>
     </w:p>
     <w:p/>
     <w:p>
@@ -1966,6 +2089,7 @@
         </w:numPr>
       </w:pPr>
       <w:r>
+        <w:lastRenderedPageBreak/>
         <w:t>kupon módosítása</w:t>
       </w:r>
       <w:r>
@@ -1987,9 +2111,6 @@
       </w:r>
       <w:r>
         <w:br/>
-      </w:r>
-      <w:r>
-        <w:lastRenderedPageBreak/>
         <w:t>"kezdesi_datum":"",</w:t>
       </w:r>
       <w:r>
@@ -2015,6 +2136,13 @@
       <w:r>
         <w:br/>
         <w:t>}</w:t>
+      </w:r>
+      <w:r>
+        <w:br/>
+        <w:t xml:space="preserve">-- Controllere: </w:t>
+      </w:r>
+      <w:r>
+        <w:t>KuponController</w:t>
       </w:r>
     </w:p>
     <w:p/>
@@ -2061,6 +2189,16 @@
       <w:r>
         <w:t>bearer: session token (hogy ha a megadott id nem a sajátod akkor csak 2 vagy nagyobb jogosultsagi szinttel tudod azt torolni)</w:t>
       </w:r>
+      <w:r>
+        <w:t xml:space="preserve"> </w:t>
+      </w:r>
+      <w:r>
+        <w:br/>
+        <w:t xml:space="preserve">-- Controllere: </w:t>
+      </w:r>
+      <w:r>
+        <w:t>UserController</w:t>
+      </w:r>
     </w:p>
     <w:p/>
     <w:p>
@@ -2089,6 +2227,16 @@
       <w:r>
         <w:t>bearer: session token (csak olyan vevesi listad tudsz torolni ami a tied vagy, ha csoporthoz tartozik akkor csak nagyobb vagy egyenlo mint 1 jogosultsággal lehet abba a csoportba)</w:t>
       </w:r>
+      <w:r>
+        <w:t xml:space="preserve"> </w:t>
+      </w:r>
+      <w:r>
+        <w:br/>
+        <w:t xml:space="preserve">-- Controllere: </w:t>
+      </w:r>
+      <w:r>
+        <w:t>VevesObjektumController</w:t>
+      </w:r>
     </w:p>
     <w:p/>
     <w:p>
@@ -2117,6 +2265,19 @@
       <w:r>
         <w:t>bearer: session token (csak olyan vevesi listad tudsz torolni ami a tied vagy, ha csoporthoz tartozik akkor csak nagyobb vagy egyenlo mint 1 jogosultsággal lehet abba a csoportba)</w:t>
       </w:r>
+      <w:r>
+        <w:t xml:space="preserve"> </w:t>
+      </w:r>
+      <w:r>
+        <w:br/>
+        <w:t>-- Controllere: Veves</w:t>
+      </w:r>
+      <w:r>
+        <w:t>Lista</w:t>
+      </w:r>
+      <w:r>
+        <w:t>Controller</w:t>
+      </w:r>
     </w:p>
     <w:p/>
     <w:p>
@@ -2145,6 +2306,16 @@
       <w:r>
         <w:t>bearer: session token (csak olyan csoportot tudsz torolni ami a tied)</w:t>
       </w:r>
+      <w:r>
+        <w:t xml:space="preserve"> </w:t>
+      </w:r>
+      <w:r>
+        <w:br/>
+        <w:t xml:space="preserve">-- Controllere: </w:t>
+      </w:r>
+      <w:r>
+        <w:t>CsoportokController</w:t>
+      </w:r>
     </w:p>
     <w:p/>
     <w:p>
@@ -2174,7 +2345,21 @@
         <w:br/>
       </w:r>
       <w:r>
-        <w:t>bearer: session token (csak olyan csoporttagsagot tudsz torolni ami a tied vagy olyan csoportba van ami a tied)</w:t>
+        <w:t xml:space="preserve">bearer: session token (csak olyan csoporttagsagot tudsz torolni ami a tied vagy olyan </w:t>
+      </w:r>
+      <w:r>
+        <w:lastRenderedPageBreak/>
+        <w:t>csoportba van ami a tied)</w:t>
+      </w:r>
+      <w:r>
+        <w:t xml:space="preserve"> </w:t>
+      </w:r>
+      <w:r>
+        <w:br/>
+        <w:t xml:space="preserve">-- Controllere: </w:t>
+      </w:r>
+      <w:r>
+        <w:t>CsoportTagsagController</w:t>
       </w:r>
     </w:p>
     <w:p/>
@@ -2207,6 +2392,16 @@
       <w:r>
         <w:t>bearer: session token (csak nagyobb mint 0 jogosultsagu szintu tud)</w:t>
       </w:r>
+      <w:r>
+        <w:t xml:space="preserve"> </w:t>
+      </w:r>
+      <w:r>
+        <w:br/>
+        <w:t xml:space="preserve">-- Controllere: </w:t>
+      </w:r>
+      <w:r>
+        <w:t>KuponController</w:t>
+      </w:r>
     </w:p>
     <w:p/>
     <w:p>
@@ -2218,7 +2413,6 @@
         </w:numPr>
       </w:pPr>
       <w:r>
-        <w:lastRenderedPageBreak/>
         <w:t>Kitöltött ürlap törlése</w:t>
       </w:r>
       <w:r>
@@ -2238,6 +2432,16 @@
       </w:r>
       <w:r>
         <w:t>bearer: session token (csak nagyobb mint 1 jogosultsagu szintu tud)</w:t>
+      </w:r>
+      <w:r>
+        <w:t xml:space="preserve"> </w:t>
+      </w:r>
+      <w:r>
+        <w:br/>
+        <w:t xml:space="preserve">-- Controllere: </w:t>
+      </w:r>
+      <w:r>
+        <w:t>ContactController</w:t>
       </w:r>
     </w:p>
     <w:sectPr>

</xml_diff>

<commit_message>
több validácios változás és dokumentácio
</commit_message>
<xml_diff>
--- a/Documents/BackendFejlesztoi.docx
+++ b/Documents/BackendFejlesztoi.docx
@@ -1636,7 +1636,7 @@
         <w:t xml:space="preserve"> ##szöveg</w:t>
       </w:r>
       <w:r>
-        <w:t>, 1 minimum hossz</w:t>
+        <w:t>, lehet üres</w:t>
       </w:r>
       <w:r>
         <w:br/>
@@ -1864,12 +1864,27 @@
         <w:t>"felhasznalo_id_valtoztatni":"",</w:t>
       </w:r>
       <w:r>
+        <w:t xml:space="preserve"> ##szám, létezö felhasználó id</w:t>
+      </w:r>
+      <w:r>
         <w:br/>
         <w:t>"nev":"",</w:t>
       </w:r>
       <w:r>
+        <w:t xml:space="preserve">  ##szöveg, 1 minimum hossz</w:t>
+      </w:r>
+      <w:r>
         <w:br/>
         <w:t>"becenev":"",</w:t>
+      </w:r>
+      <w:r>
+        <w:t xml:space="preserve"> </w:t>
+      </w:r>
+      <w:r>
+        <w:t>##szöveg</w:t>
+      </w:r>
+      <w:r>
+        <w:t>, lehet üres</w:t>
       </w:r>
       <w:r>
         <w:br/>
@@ -1879,18 +1894,60 @@
         <w:t>"profilkep_url":"",</w:t>
       </w:r>
       <w:r>
+        <w:t xml:space="preserve"> </w:t>
+      </w:r>
+      <w:r>
+        <w:t>##szöveg, 1 minimum hossz</w:t>
+      </w:r>
+      <w:r>
         <w:br/>
         <w:t>"kuponok":"",</w:t>
       </w:r>
       <w:r>
+        <w:t xml:space="preserve"> </w:t>
+      </w:r>
+      <w:r>
+        <w:t>##</w:t>
+      </w:r>
+      <w:r>
+        <w:t>szám</w:t>
+      </w:r>
+      <w:r>
+        <w:t xml:space="preserve">, 1 </w:t>
+      </w:r>
+      <w:r>
+        <w:t>vagy 0</w:t>
+      </w:r>
+      <w:r>
         <w:br/>
         <w:t>"termekArKovetes":"",</w:t>
       </w:r>
       <w:r>
+        <w:t xml:space="preserve"> </w:t>
+      </w:r>
+      <w:r>
+        <w:t>##szám, 1 vagy 0</w:t>
+      </w:r>
+      <w:r>
         <w:br/>
         <w:t>"brokerArKovetes":""</w:t>
       </w:r>
       <w:r>
+        <w:t xml:space="preserve">, </w:t>
+      </w:r>
+      <w:r>
+        <w:t>##szám, 1 vagy 0</w:t>
+      </w:r>
+      <w:r>
+        <w:br/>
+      </w:r>
+      <w:r>
+        <w:t>'jogosultsag_szint'</w:t>
+      </w:r>
+      <w:r>
+        <w:t>:”” ##szám, minimum 0</w:t>
+      </w:r>
+      <w:r>
         <w:br/>
         <w:t>}</w:t>
       </w:r>
@@ -1945,14 +2002,34 @@
         <w:t>"megnevezes":"",</w:t>
       </w:r>
       <w:r>
+        <w:t xml:space="preserve"> </w:t>
+      </w:r>
+      <w:r>
+        <w:t>##szöveg, 1 minimum hossz</w:t>
+      </w:r>
+      <w:r>
         <w:br/>
         <w:t>"csoport_tipus_id":"",</w:t>
       </w:r>
       <w:r>
-        <w:br/>
+        <w:t xml:space="preserve"> </w:t>
+      </w:r>
+      <w:r>
+        <w:t>##</w:t>
+      </w:r>
+      <w:r>
+        <w:t>szám, létezö csoport tipus id</w:t>
+      </w:r>
+      <w:r>
+        <w:br/>
+      </w:r>
+      <w:r>
         <w:t>"keszito_felhasznalo_id":""</w:t>
       </w:r>
       <w:r>
+        <w:t xml:space="preserve"> ##szám, létezö felhasználo id</w:t>
+      </w:r>
+      <w:r>
         <w:br/>
         <w:t>}</w:t>
       </w:r>
@@ -1998,12 +2075,21 @@
         <w:t>"becenev":"",</w:t>
       </w:r>
       <w:r>
+        <w:t xml:space="preserve"> ##szöveg, lehet üres</w:t>
+      </w:r>
+      <w:r>
         <w:br/>
         <w:t>"mastValtoztatniId":"",</w:t>
       </w:r>
       <w:r>
+        <w:t xml:space="preserve"> ##szám, létezö felhasználó id</w:t>
+      </w:r>
+      <w:r>
         <w:br/>
         <w:t>"jogosultsag_szint":""</w:t>
+      </w:r>
+      <w:r>
+        <w:t xml:space="preserve"> ##szám, minimum 0</w:t>
       </w:r>
       <w:r>
         <w:br/>
@@ -2052,20 +2138,35 @@
         <w:t>"alKategoria_id":"",</w:t>
       </w:r>
       <w:r>
+        <w:t xml:space="preserve"> ##szám, létezö alkategoria id</w:t>
+      </w:r>
+      <w:r>
         <w:br/>
         <w:t>"megnevezes":"",</w:t>
       </w:r>
       <w:r>
+        <w:t xml:space="preserve"> ##szöveg, minimum 1 hossz</w:t>
+      </w:r>
+      <w:r>
         <w:br/>
         <w:t>"ar":"",</w:t>
       </w:r>
       <w:r>
+        <w:t xml:space="preserve"> ##szám, minimum 0</w:t>
+      </w:r>
+      <w:r>
         <w:br/>
         <w:t>"mennyiseg":"",</w:t>
       </w:r>
       <w:r>
+        <w:t xml:space="preserve"> ##szám, minimum 0</w:t>
+      </w:r>
+      <w:r>
         <w:br/>
         <w:t>"elfogadott_statisztikara":""</w:t>
+      </w:r>
+      <w:r>
+        <w:t xml:space="preserve">  ##szám, 1 vagy 0</w:t>
       </w:r>
       <w:r>
         <w:br/>
@@ -2114,24 +2215,42 @@
         <w:t>"kezdesi_datum":"",</w:t>
       </w:r>
       <w:r>
+        <w:t xml:space="preserve"> ##dátum</w:t>
+      </w:r>
+      <w:r>
         <w:br/>
         <w:t>"lejarasi_datum":"",</w:t>
       </w:r>
       <w:r>
+        <w:t xml:space="preserve"> ##dátum</w:t>
+      </w:r>
+      <w:r>
         <w:br/>
         <w:t>"kod":"",</w:t>
       </w:r>
       <w:r>
+        <w:t xml:space="preserve"> ##szöveg, minimum 1 hossz</w:t>
+      </w:r>
+      <w:r>
         <w:br/>
         <w:t>"kedvezmeny":"",</w:t>
       </w:r>
       <w:r>
+        <w:t xml:space="preserve"> ##szöveg, 1 minimum hossz</w:t>
+      </w:r>
+      <w:r>
         <w:br/>
         <w:t xml:space="preserve">"megjegyzes":"", </w:t>
       </w:r>
       <w:r>
+        <w:t xml:space="preserve"> ##szöveg, lehet üres</w:t>
+      </w:r>
+      <w:r>
         <w:br/>
         <w:t>"hasznalasi_hely":""</w:t>
+      </w:r>
+      <w:r>
+        <w:t xml:space="preserve"> ##szöveg, 1 minimum hossz</w:t>
       </w:r>
       <w:r>
         <w:br/>

</xml_diff>

<commit_message>
Kis változás egy végpontban
</commit_message>
<xml_diff>
--- a/Documents/BackendFejlesztoi.docx
+++ b/Documents/BackendFejlesztoi.docx
@@ -812,6 +812,9 @@
         <w:t>egy felhasználó összes vevési listája</w:t>
       </w:r>
       <w:r>
+        <w:t xml:space="preserve"> (kivéve ami csoporthoz van kötve)</w:t>
+      </w:r>
+      <w:r>
         <w:br/>
       </w:r>
       <w:r>
@@ -864,10 +867,7 @@
       </w:r>
       <w:r>
         <w:br/>
-        <w:t xml:space="preserve">-- Controllere: </w:t>
-      </w:r>
-      <w:r>
-        <w:t>UserController</w:t>
+        <w:t>-- Controllere: UserController</w:t>
       </w:r>
     </w:p>
     <w:p/>
@@ -1134,10 +1134,7 @@
       </w:r>
       <w:r>
         <w:br/>
-        <w:t xml:space="preserve">-- Controllere: </w:t>
-      </w:r>
-      <w:r>
-        <w:t>KuponController</w:t>
+        <w:t>-- Controllere: KuponController</w:t>
       </w:r>
     </w:p>
     <w:p/>
@@ -1172,10 +1169,7 @@
       </w:r>
       <w:r>
         <w:br/>
-        <w:t xml:space="preserve">-- Controllere: </w:t>
-      </w:r>
-      <w:r>
-        <w:t>UserController</w:t>
+        <w:t>-- Controllere: UserController</w:t>
       </w:r>
     </w:p>
     <w:p/>
@@ -1205,10 +1199,7 @@
       </w:r>
       <w:r>
         <w:br/>
-        <w:t xml:space="preserve">-- Controllere: </w:t>
-      </w:r>
-      <w:r>
-        <w:t>CsoportTagsagController</w:t>
+        <w:t>-- Controllere: CsoportTagsagController</w:t>
       </w:r>
     </w:p>
     <w:p/>
@@ -1241,10 +1232,7 @@
       </w:r>
       <w:r>
         <w:br/>
-        <w:t xml:space="preserve">-- Controllere: </w:t>
-      </w:r>
-      <w:r>
-        <w:t>ContactController</w:t>
+        <w:t>-- Controllere: ContactController</w:t>
       </w:r>
     </w:p>
     <w:p/>
@@ -1324,10 +1312,7 @@
       </w:r>
       <w:r>
         <w:br/>
-        <w:t xml:space="preserve">-- Controllere: </w:t>
-      </w:r>
-      <w:r>
-        <w:t>UserController</w:t>
+        <w:t>-- Controllere: UserController</w:t>
       </w:r>
     </w:p>
     <w:p/>
@@ -1429,10 +1414,7 @@
       </w:r>
       <w:r>
         <w:br/>
-        <w:t xml:space="preserve">-- Controllere: </w:t>
-      </w:r>
-      <w:r>
-        <w:t>CsoportokController</w:t>
+        <w:t>-- Controllere: CsoportokController</w:t>
       </w:r>
     </w:p>
     <w:p/>
@@ -1490,10 +1472,7 @@
       </w:r>
       <w:r>
         <w:br/>
-        <w:t xml:space="preserve">-- Controllere: </w:t>
-      </w:r>
-      <w:r>
-        <w:t>ContactController</w:t>
+        <w:t>-- Controllere: ContactController</w:t>
       </w:r>
     </w:p>
     <w:p/>
@@ -1556,10 +1535,7 @@
       </w:r>
       <w:r>
         <w:br/>
-        <w:t xml:space="preserve">-- Controllere: </w:t>
-      </w:r>
-      <w:r>
-        <w:t>CsoportTagsagController</w:t>
+        <w:t>-- Controllere: CsoportTagsagController</w:t>
       </w:r>
     </w:p>
     <w:p/>
@@ -1654,10 +1630,83 @@
       </w:r>
       <w:r>
         <w:br/>
+        <w:t>-- Controllere: KuponController</w:t>
+      </w:r>
+    </w:p>
+    <w:p/>
+    <w:p>
+      <w:pPr>
+        <w:pStyle w:val="Listaszerbekezds"/>
+        <w:numPr>
+          <w:ilvl w:val="0"/>
+          <w:numId w:val="2"/>
+        </w:numPr>
+      </w:pPr>
+      <w:r>
+        <w:t>vevési objektum létrehozása</w:t>
+      </w:r>
+      <w:r>
+        <w:br/>
+      </w:r>
+      <w:r>
+        <w:rPr>
+          <w:u w:val="single"/>
+        </w:rPr>
+        <w:t>(http://127.0.0.1:8000/api/vevesiObjektum/create)</w:t>
+      </w:r>
+      <w:r>
+        <w:br/>
+        <w:t>bearer: session token (csoportnál csak az tud aki benne van a csoportba és nagyobb jogosultság szint mint 0)</w:t>
+      </w:r>
+      <w:r>
+        <w:br/>
+        <w:t>{</w:t>
+      </w:r>
+      <w:r>
+        <w:br/>
+        <w:t>"veves_lista_id":"", ##Muszály</w:t>
+      </w:r>
+      <w:r>
+        <w:t xml:space="preserve"> szám, létezö vevési lista id</w:t>
+      </w:r>
+      <w:r>
+        <w:br/>
+        <w:t>"alKategoria_id":"", ##Muszály</w:t>
+      </w:r>
+      <w:r>
+        <w:t xml:space="preserve"> szám, létezö alkategoria id</w:t>
+      </w:r>
+      <w:r>
+        <w:br/>
+        <w:t>"megnevezes":"",</w:t>
+      </w:r>
+      <w:r>
+        <w:t xml:space="preserve"> ##szöveg, 1 minimum hossz</w:t>
+      </w:r>
+      <w:r>
+        <w:br/>
+        <w:t>"ar":"", ##Muszály</w:t>
+      </w:r>
+      <w:r>
+        <w:t xml:space="preserve"> szám, minimum 0 </w:t>
+      </w:r>
+      <w:r>
+        <w:br/>
+        <w:t>"mennyiseg":"" ##Muszály</w:t>
+      </w:r>
+      <w:r>
+        <w:t xml:space="preserve"> szám, minimum 0</w:t>
+      </w:r>
+      <w:r>
+        <w:br/>
+        <w:t>}</w:t>
+      </w:r>
+      <w:r>
+        <w:br/>
         <w:t xml:space="preserve">-- Controllere: </w:t>
       </w:r>
       <w:r>
-        <w:t>KuponController</w:t>
+        <w:t>VevesObjektumController</w:t>
       </w:r>
     </w:p>
     <w:p/>
@@ -1670,7 +1719,7 @@
         </w:numPr>
       </w:pPr>
       <w:r>
-        <w:t>vevési objektum létrehozása</w:t>
+        <w:t>vevési lista létrehozása</w:t>
       </w:r>
       <w:r>
         <w:br/>
@@ -1679,7 +1728,7 @@
         <w:rPr>
           <w:u w:val="single"/>
         </w:rPr>
-        <w:t>(http://127.0.0.1:8000/api/vevesiObjektum/create)</w:t>
+        <w:t>(http://127.0.0.1:8000/api/vevesiLista/create)</w:t>
       </w:r>
       <w:r>
         <w:br/>
@@ -1691,82 +1740,6 @@
       </w:r>
       <w:r>
         <w:br/>
-        <w:t>"veves_lista_id":"", ##Muszály</w:t>
-      </w:r>
-      <w:r>
-        <w:t xml:space="preserve"> szám, létezö vevési lista id</w:t>
-      </w:r>
-      <w:r>
-        <w:br/>
-        <w:t>"alKategoria_id":"", ##Muszály</w:t>
-      </w:r>
-      <w:r>
-        <w:t xml:space="preserve"> szám, létezö alkategoria id</w:t>
-      </w:r>
-      <w:r>
-        <w:br/>
-        <w:t>"megnevezes":"",</w:t>
-      </w:r>
-      <w:r>
-        <w:t xml:space="preserve"> ##szöveg, 1 minimum hossz</w:t>
-      </w:r>
-      <w:r>
-        <w:br/>
-        <w:t>"ar":"", ##Muszály</w:t>
-      </w:r>
-      <w:r>
-        <w:t xml:space="preserve"> szám, minimum 0 </w:t>
-      </w:r>
-      <w:r>
-        <w:br/>
-        <w:t>"mennyiseg":"" ##Muszály</w:t>
-      </w:r>
-      <w:r>
-        <w:t xml:space="preserve"> szám, minimum 0</w:t>
-      </w:r>
-      <w:r>
-        <w:br/>
-        <w:t>}</w:t>
-      </w:r>
-      <w:r>
-        <w:br/>
-        <w:t xml:space="preserve">-- Controllere: </w:t>
-      </w:r>
-      <w:r>
-        <w:t>VevesObjektumController</w:t>
-      </w:r>
-    </w:p>
-    <w:p/>
-    <w:p>
-      <w:pPr>
-        <w:pStyle w:val="Listaszerbekezds"/>
-        <w:numPr>
-          <w:ilvl w:val="0"/>
-          <w:numId w:val="2"/>
-        </w:numPr>
-      </w:pPr>
-      <w:r>
-        <w:t>vevési lista létrehozása</w:t>
-      </w:r>
-      <w:r>
-        <w:br/>
-      </w:r>
-      <w:r>
-        <w:rPr>
-          <w:u w:val="single"/>
-        </w:rPr>
-        <w:t>(http://127.0.0.1:8000/api/vevesiLista/create)</w:t>
-      </w:r>
-      <w:r>
-        <w:br/>
-        <w:t>bearer: session token (csoportnál csak az tud aki benne van a csoportba és nagyobb jogosultság szint mint 0)</w:t>
-      </w:r>
-      <w:r>
-        <w:br/>
-        <w:t>{</w:t>
-      </w:r>
-      <w:r>
-        <w:br/>
         <w:t>"felhasznalo_id":"", ##Muszály</w:t>
       </w:r>
       <w:r>
@@ -1781,13 +1754,7 @@
       </w:r>
       <w:r>
         <w:br/>
-        <w:t>"</w:t>
-      </w:r>
-      <w:r>
-        <w:t>megnevezes</w:t>
-      </w:r>
-      <w:r>
-        <w:t>":"", ##Muszály</w:t>
+        <w:t>"megnevezes":"", ##Muszály</w:t>
       </w:r>
       <w:r>
         <w:t xml:space="preserve"> szöveg, 1 minimum hossz</w:t>
@@ -1878,13 +1845,7 @@
         <w:t>"becenev":"",</w:t>
       </w:r>
       <w:r>
-        <w:t xml:space="preserve"> </w:t>
-      </w:r>
-      <w:r>
-        <w:t>##szöveg</w:t>
-      </w:r>
-      <w:r>
-        <w:t>, lehet üres</w:t>
+        <w:t xml:space="preserve"> ##szöveg, lehet üres</w:t>
       </w:r>
       <w:r>
         <w:br/>
@@ -1894,58 +1855,32 @@
         <w:t>"profilkep_url":"",</w:t>
       </w:r>
       <w:r>
-        <w:t xml:space="preserve"> </w:t>
-      </w:r>
-      <w:r>
-        <w:t>##szöveg, 1 minimum hossz</w:t>
+        <w:t xml:space="preserve"> ##szöveg, 1 minimum hossz</w:t>
       </w:r>
       <w:r>
         <w:br/>
         <w:t>"kuponok":"",</w:t>
       </w:r>
       <w:r>
-        <w:t xml:space="preserve"> </w:t>
-      </w:r>
-      <w:r>
-        <w:t>##</w:t>
-      </w:r>
-      <w:r>
-        <w:t>szám</w:t>
-      </w:r>
-      <w:r>
-        <w:t xml:space="preserve">, 1 </w:t>
-      </w:r>
-      <w:r>
-        <w:t>vagy 0</w:t>
+        <w:t xml:space="preserve"> ##szám, 1 vagy 0</w:t>
       </w:r>
       <w:r>
         <w:br/>
         <w:t>"termekArKovetes":"",</w:t>
       </w:r>
       <w:r>
-        <w:t xml:space="preserve"> </w:t>
-      </w:r>
-      <w:r>
-        <w:t>##szám, 1 vagy 0</w:t>
+        <w:t xml:space="preserve"> ##szám, 1 vagy 0</w:t>
       </w:r>
       <w:r>
         <w:br/>
         <w:t>"brokerArKovetes":""</w:t>
       </w:r>
       <w:r>
-        <w:t xml:space="preserve">, </w:t>
-      </w:r>
-      <w:r>
-        <w:t>##szám, 1 vagy 0</w:t>
-      </w:r>
-      <w:r>
-        <w:br/>
-      </w:r>
-      <w:r>
-        <w:t>'jogosultsag_szint'</w:t>
-      </w:r>
-      <w:r>
-        <w:t>:”” ##szám, minimum 0</w:t>
+        <w:t>, ##szám, 1 vagy 0</w:t>
+      </w:r>
+      <w:r>
+        <w:br/>
+        <w:t>'jogosultsag_szint':”” ##szám, minimum 0</w:t>
       </w:r>
       <w:r>
         <w:br/>
@@ -1953,10 +1888,7 @@
       </w:r>
       <w:r>
         <w:br/>
-        <w:t xml:space="preserve">-- Controllere: </w:t>
-      </w:r>
-      <w:r>
-        <w:t>UserController</w:t>
+        <w:t>-- Controllere: UserController</w:t>
       </w:r>
     </w:p>
     <w:p>
@@ -2002,23 +1934,14 @@
         <w:t>"megnevezes":"",</w:t>
       </w:r>
       <w:r>
-        <w:t xml:space="preserve"> </w:t>
-      </w:r>
-      <w:r>
-        <w:t>##szöveg, 1 minimum hossz</w:t>
+        <w:t xml:space="preserve"> ##szöveg, 1 minimum hossz</w:t>
       </w:r>
       <w:r>
         <w:br/>
         <w:t>"csoport_tipus_id":"",</w:t>
       </w:r>
       <w:r>
-        <w:t xml:space="preserve"> </w:t>
-      </w:r>
-      <w:r>
-        <w:t>##</w:t>
-      </w:r>
-      <w:r>
-        <w:t>szám, létezö csoport tipus id</w:t>
+        <w:t xml:space="preserve"> ##szám, létezö csoport tipus id</w:t>
       </w:r>
       <w:r>
         <w:br/>
@@ -2035,10 +1958,7 @@
       </w:r>
       <w:r>
         <w:br/>
-        <w:t xml:space="preserve">-- Controllere: </w:t>
-      </w:r>
-      <w:r>
-        <w:t>CsoportokController</w:t>
+        <w:t>-- Controllere: CsoportokController</w:t>
       </w:r>
     </w:p>
     <w:p/>
@@ -2097,10 +2017,7 @@
       </w:r>
       <w:r>
         <w:br/>
-        <w:t xml:space="preserve">-- Controllere: </w:t>
-      </w:r>
-      <w:r>
-        <w:t>CsoportTagsagController</w:t>
+        <w:t>-- Controllere: CsoportTagsagController</w:t>
       </w:r>
     </w:p>
     <w:p/>
@@ -2258,10 +2175,7 @@
       </w:r>
       <w:r>
         <w:br/>
-        <w:t xml:space="preserve">-- Controllere: </w:t>
-      </w:r>
-      <w:r>
-        <w:t>KuponController</w:t>
+        <w:t>-- Controllere: KuponController</w:t>
       </w:r>
     </w:p>
     <w:p/>
@@ -2313,10 +2227,45 @@
       </w:r>
       <w:r>
         <w:br/>
+        <w:t>-- Controllere: UserController</w:t>
+      </w:r>
+    </w:p>
+    <w:p/>
+    <w:p>
+      <w:pPr>
+        <w:pStyle w:val="Listaszerbekezds"/>
+        <w:numPr>
+          <w:ilvl w:val="0"/>
+          <w:numId w:val="4"/>
+        </w:numPr>
+      </w:pPr>
+      <w:r>
+        <w:t>vevési objektum törlése</w:t>
+      </w:r>
+      <w:r>
+        <w:br/>
+      </w:r>
+      <w:r>
+        <w:rPr>
+          <w:u w:val="single"/>
+        </w:rPr>
+        <w:t>(http://127.0.0.1:8000/api/vevesiObjektum/torles/{id})</w:t>
+      </w:r>
+      <w:r>
+        <w:br/>
+      </w:r>
+      <w:r>
+        <w:t>bearer: session token (csak olyan vevesi listad tudsz torolni ami a tied vagy, ha csoporthoz tartozik akkor csak nagyobb vagy egyenlo mint 1 jogosultsággal lehet abba a csoportba)</w:t>
+      </w:r>
+      <w:r>
+        <w:t xml:space="preserve"> </w:t>
+      </w:r>
+      <w:r>
+        <w:br/>
         <w:t xml:space="preserve">-- Controllere: </w:t>
       </w:r>
       <w:r>
-        <w:t>UserController</w:t>
+        <w:t>VevesObjektumController</w:t>
       </w:r>
     </w:p>
     <w:p/>
@@ -2329,7 +2278,7 @@
         </w:numPr>
       </w:pPr>
       <w:r>
-        <w:t>vevési objektum törlése</w:t>
+        <w:t>vevési lista törlése</w:t>
       </w:r>
       <w:r>
         <w:br/>
@@ -2338,7 +2287,7 @@
         <w:rPr>
           <w:u w:val="single"/>
         </w:rPr>
-        <w:t>(http://127.0.0.1:8000/api/vevesiObjektum/torles/{id})</w:t>
+        <w:t>(http://127.0.0.1:8000/api/vevesiLista/torles/{id})</w:t>
       </w:r>
       <w:r>
         <w:br/>
@@ -2351,10 +2300,7 @@
       </w:r>
       <w:r>
         <w:br/>
-        <w:t xml:space="preserve">-- Controllere: </w:t>
-      </w:r>
-      <w:r>
-        <w:t>VevesObjektumController</w:t>
+        <w:t>-- Controllere: VevesListaController</w:t>
       </w:r>
     </w:p>
     <w:p/>
@@ -2367,7 +2313,7 @@
         </w:numPr>
       </w:pPr>
       <w:r>
-        <w:t>vevési lista törlése</w:t>
+        <w:t>csoport törlése</w:t>
       </w:r>
       <w:r>
         <w:br/>
@@ -2376,64 +2322,20 @@
         <w:rPr>
           <w:u w:val="single"/>
         </w:rPr>
-        <w:t>(http://127.0.0.1:8000/api/vevesiLista/torles/{id})</w:t>
-      </w:r>
-      <w:r>
-        <w:br/>
-      </w:r>
-      <w:r>
-        <w:t>bearer: session token (csak olyan vevesi listad tudsz torolni ami a tied vagy, ha csoporthoz tartozik akkor csak nagyobb vagy egyenlo mint 1 jogosultsággal lehet abba a csoportba)</w:t>
+        <w:t>(http://127.0.0.1:8000/api/csoport/torles/{id})</w:t>
+      </w:r>
+      <w:r>
+        <w:br/>
+      </w:r>
+      <w:r>
+        <w:t>bearer: session token (csak olyan csoportot tudsz torolni ami a tied)</w:t>
       </w:r>
       <w:r>
         <w:t xml:space="preserve"> </w:t>
       </w:r>
       <w:r>
         <w:br/>
-        <w:t>-- Controllere: Veves</w:t>
-      </w:r>
-      <w:r>
-        <w:t>Lista</w:t>
-      </w:r>
-      <w:r>
-        <w:t>Controller</w:t>
-      </w:r>
-    </w:p>
-    <w:p/>
-    <w:p>
-      <w:pPr>
-        <w:pStyle w:val="Listaszerbekezds"/>
-        <w:numPr>
-          <w:ilvl w:val="0"/>
-          <w:numId w:val="4"/>
-        </w:numPr>
-      </w:pPr>
-      <w:r>
-        <w:t>csoport törlése</w:t>
-      </w:r>
-      <w:r>
-        <w:br/>
-      </w:r>
-      <w:r>
-        <w:rPr>
-          <w:u w:val="single"/>
-        </w:rPr>
-        <w:t>(http://127.0.0.1:8000/api/csoport/torles/{id})</w:t>
-      </w:r>
-      <w:r>
-        <w:br/>
-      </w:r>
-      <w:r>
-        <w:t>bearer: session token (csak olyan csoportot tudsz torolni ami a tied)</w:t>
-      </w:r>
-      <w:r>
-        <w:t xml:space="preserve"> </w:t>
-      </w:r>
-      <w:r>
-        <w:br/>
-        <w:t xml:space="preserve">-- Controllere: </w:t>
-      </w:r>
-      <w:r>
-        <w:t>CsoportokController</w:t>
+        <w:t>-- Controllere: CsoportokController</w:t>
       </w:r>
     </w:p>
     <w:p/>
@@ -2475,10 +2377,7 @@
       </w:r>
       <w:r>
         <w:br/>
-        <w:t xml:space="preserve">-- Controllere: </w:t>
-      </w:r>
-      <w:r>
-        <w:t>CsoportTagsagController</w:t>
+        <w:t>-- Controllere: CsoportTagsagController</w:t>
       </w:r>
     </w:p>
     <w:p/>
@@ -2516,10 +2415,7 @@
       </w:r>
       <w:r>
         <w:br/>
-        <w:t xml:space="preserve">-- Controllere: </w:t>
-      </w:r>
-      <w:r>
-        <w:t>KuponController</w:t>
+        <w:t>-- Controllere: KuponController</w:t>
       </w:r>
     </w:p>
     <w:p/>
@@ -2557,10 +2453,7 @@
       </w:r>
       <w:r>
         <w:br/>
-        <w:t xml:space="preserve">-- Controllere: </w:t>
-      </w:r>
-      <w:r>
-        <w:t>ContactController</w:t>
+        <w:t>-- Controllere: ContactController</w:t>
       </w:r>
     </w:p>
     <w:sectPr>

</xml_diff>

<commit_message>
admin végpontok + admin elérhet bármilyen csoportot + felhasznalo mennyiség végpont + env fájl
</commit_message>
<xml_diff>
--- a/Documents/BackendFejlesztoi.docx
+++ b/Documents/BackendFejlesztoi.docx
@@ -813,12 +813,22 @@
       </w:r>
       <w:r>
         <w:br/>
-      </w:r>
-      <w:r>
-        <w:t>(http://127.0.0.1:8000/api/alkategoriak)</w:t>
-      </w:r>
-      <w:r>
-        <w:br/>
+        <w:t>(</w:t>
+      </w:r>
+      <w:r>
+        <w:t>http://127.0.0.1:8000/api/alkategoriak</w:t>
+      </w:r>
+      <w:r>
+        <w:t>)</w:t>
+      </w:r>
+      <w:r>
+        <w:br/>
+      </w:r>
+      <w:r>
+        <w:t xml:space="preserve">Controllere: </w:t>
+      </w:r>
+      <w:r>
+        <w:t>AlkategoriakController</w:t>
       </w:r>
       <w:r>
         <w:br/>
@@ -833,6 +843,44 @@
         </w:numPr>
       </w:pPr>
       <w:r>
+        <w:t>felhasználo mennyiség</w:t>
+      </w:r>
+      <w:r>
+        <w:br/>
+        <w:t>(http://127.0.0.1:8000/api/</w:t>
+      </w:r>
+      <w:r>
+        <w:t>felhasznaloMennyiseg</w:t>
+      </w:r>
+      <w:r>
+        <w:t>)</w:t>
+      </w:r>
+      <w:r>
+        <w:t xml:space="preserve"> </w:t>
+      </w:r>
+      <w:r>
+        <w:br/>
+        <w:t xml:space="preserve">Controllere: </w:t>
+      </w:r>
+      <w:r>
+        <w:t>UserController</w:t>
+      </w:r>
+      <w:r>
+        <w:br/>
+      </w:r>
+      <w:r>
+        <w:br/>
+      </w:r>
+    </w:p>
+    <w:p>
+      <w:pPr>
+        <w:pStyle w:val="Listaszerbekezds"/>
+        <w:numPr>
+          <w:ilvl w:val="0"/>
+          <w:numId w:val="1"/>
+        </w:numPr>
+      </w:pPr>
+      <w:r>
         <w:t>egy felhasználó összes vevési listája</w:t>
       </w:r>
       <w:r>
@@ -1003,6 +1051,7 @@
         </w:numPr>
       </w:pPr>
       <w:r>
+        <w:lastRenderedPageBreak/>
         <w:t>egy felhasználó összes költsége ebben az évben</w:t>
       </w:r>
       <w:r>
@@ -1039,17 +1088,321 @@
         </w:rPr>
       </w:pPr>
       <w:r>
+        <w:t>összes alkategória átlag árának havi váltakozása</w:t>
+      </w:r>
+      <w:r>
+        <w:br/>
+      </w:r>
+      <w:r>
+        <w:rPr>
+          <w:u w:val="single"/>
+        </w:rPr>
+        <w:t>(http://127.0.0.1:8000/api/statisztika/all)</w:t>
+      </w:r>
+      <w:r>
+        <w:t xml:space="preserve"> </w:t>
+      </w:r>
+      <w:r>
+        <w:br/>
+        <w:t xml:space="preserve">-- Controllere: </w:t>
+      </w:r>
+      <w:r>
+        <w:t>VevesObjektumController</w:t>
+      </w:r>
+    </w:p>
+    <w:p/>
+    <w:p>
+      <w:pPr>
+        <w:pStyle w:val="Listaszerbekezds"/>
+        <w:numPr>
+          <w:ilvl w:val="0"/>
+          <w:numId w:val="1"/>
+        </w:numPr>
+        <w:rPr>
+          <w:u w:val="single"/>
+        </w:rPr>
+      </w:pPr>
+      <w:r>
+        <w:t>egy alkategória átlag árának havi váltakozása</w:t>
+      </w:r>
+      <w:r>
+        <w:br/>
+      </w:r>
+      <w:r>
+        <w:rPr>
+          <w:u w:val="single"/>
+        </w:rPr>
+        <w:t>(http://127.0.0.1:8000/api/statisztika/id/{id})</w:t>
+      </w:r>
+      <w:r>
+        <w:br/>
+        <w:t xml:space="preserve">-- Controllere: </w:t>
+      </w:r>
+      <w:r>
+        <w:t>VevesObjektumController</w:t>
+      </w:r>
+    </w:p>
+    <w:p/>
+    <w:p>
+      <w:pPr>
+        <w:pStyle w:val="Listaszerbekezds"/>
+        <w:numPr>
+          <w:ilvl w:val="0"/>
+          <w:numId w:val="1"/>
+        </w:numPr>
+        <w:rPr>
+          <w:u w:val="single"/>
+        </w:rPr>
+      </w:pPr>
+      <w:r>
+        <w:t>összes alkategória jelenlegi átlagára ebben az évben</w:t>
+      </w:r>
+      <w:r>
+        <w:br/>
+      </w:r>
+      <w:r>
+        <w:rPr>
+          <w:u w:val="single"/>
+        </w:rPr>
+        <w:t>(http://127.0.0.1:8000/api/statisztika/ev/{ev})</w:t>
+      </w:r>
+      <w:r>
+        <w:br/>
+        <w:t xml:space="preserve">-- Controllere: </w:t>
+      </w:r>
+      <w:r>
+        <w:t>VevesObjektumController</w:t>
+      </w:r>
+    </w:p>
+    <w:p>
+      <w:pPr>
+        <w:rPr>
+          <w:u w:val="single"/>
+        </w:rPr>
+      </w:pPr>
+    </w:p>
+    <w:p>
+      <w:pPr>
+        <w:pStyle w:val="Listaszerbekezds"/>
+        <w:numPr>
+          <w:ilvl w:val="0"/>
+          <w:numId w:val="1"/>
+        </w:numPr>
+      </w:pPr>
+      <w:r>
+        <w:t>összes kupon</w:t>
+      </w:r>
+      <w:r>
+        <w:br/>
+      </w:r>
+      <w:r>
+        <w:rPr>
+          <w:u w:val="single"/>
+        </w:rPr>
+        <w:t>(http://127.0.0.1:8000/api/kuponok/get)</w:t>
+      </w:r>
+      <w:r>
+        <w:t xml:space="preserve"> </w:t>
+      </w:r>
+      <w:r>
+        <w:br/>
+        <w:t>-- Controllere: KuponController</w:t>
+      </w:r>
+    </w:p>
+    <w:p/>
+    <w:p>
+      <w:pPr>
+        <w:pStyle w:val="Listaszerbekezds"/>
+        <w:numPr>
+          <w:ilvl w:val="0"/>
+          <w:numId w:val="1"/>
+        </w:numPr>
+      </w:pPr>
+      <w:r>
+        <w:t>felhasználó nyilvános adatai</w:t>
+      </w:r>
+      <w:r>
+        <w:br/>
+      </w:r>
+      <w:r>
+        <w:rPr>
+          <w:u w:val="single"/>
+        </w:rPr>
+        <w:t>(http://127.0.0.1:8000/api/felhasznalo)</w:t>
+      </w:r>
+      <w:r>
+        <w:rPr>
+          <w:u w:val="single"/>
+        </w:rPr>
+        <w:br/>
+      </w:r>
+      <w:r>
+        <w:t>bearer: session token</w:t>
+      </w:r>
+      <w:r>
+        <w:br/>
+        <w:t>-- Controllere: UserController</w:t>
+      </w:r>
+    </w:p>
+    <w:p/>
+    <w:p>
+      <w:pPr>
+        <w:pStyle w:val="Listaszerbekezds"/>
+        <w:numPr>
+          <w:ilvl w:val="0"/>
+          <w:numId w:val="1"/>
+        </w:numPr>
+      </w:pPr>
+      <w:r>
+        <w:t>csoport felhasználoi</w:t>
+      </w:r>
+      <w:r>
+        <w:br/>
+      </w:r>
+      <w:r>
+        <w:rPr>
+          <w:u w:val="single"/>
+        </w:rPr>
+        <w:t>(http://127.0.0.1:8000/api/csoport/{id}/felhasznalok)</w:t>
+      </w:r>
+      <w:r>
+        <w:br/>
+        <w:t>bearer: session token</w:t>
+      </w:r>
+      <w:r>
+        <w:br/>
+        <w:t>-- Controllere: CsoportTagsagController</w:t>
+      </w:r>
+    </w:p>
+    <w:p/>
+    <w:p>
+      <w:pPr>
+        <w:pStyle w:val="Listaszerbekezds"/>
+        <w:numPr>
+          <w:ilvl w:val="0"/>
+          <w:numId w:val="1"/>
+        </w:numPr>
+      </w:pPr>
+      <w:r>
+        <w:t>összes kitöltött ürlap</w:t>
+      </w:r>
+      <w:r>
+        <w:br/>
+      </w:r>
+      <w:r>
+        <w:rPr>
+          <w:u w:val="single"/>
+        </w:rPr>
+        <w:t>(http://127.0.0.1:8000/api/contact)</w:t>
+      </w:r>
+      <w:r>
+        <w:br/>
+        <w:t>bearer: session token (csak nagyobb mint 1 jogosultsagu szintu tud)</w:t>
+      </w:r>
+      <w:r>
+        <w:t xml:space="preserve"> </w:t>
+      </w:r>
+      <w:r>
+        <w:br/>
+        <w:t>-- Controllere: ContactController</w:t>
+      </w:r>
+    </w:p>
+    <w:p>
+      <w:pPr>
+        <w:pStyle w:val="Listaszerbekezds"/>
+      </w:pPr>
+    </w:p>
+    <w:p>
+      <w:pPr>
+        <w:pStyle w:val="Listaszerbekezds"/>
+      </w:pPr>
+      <w:r>
+        <w:t>ADMIN VÉGPONTOK</w:t>
+      </w:r>
+    </w:p>
+    <w:p>
+      <w:pPr>
+        <w:pStyle w:val="Listaszerbekezds"/>
+        <w:numPr>
+          <w:ilvl w:val="0"/>
+          <w:numId w:val="1"/>
+        </w:numPr>
+      </w:pPr>
+      <w:r>
+        <w:t>Legfrissebb aktivitás (csak vevési listák)</w:t>
+      </w:r>
+      <w:r>
+        <w:br/>
+      </w:r>
+      <w:r>
+        <w:rPr>
+          <w:u w:val="single"/>
+        </w:rPr>
+        <w:t>(http://127.0.0.1:8000/</w:t>
+      </w:r>
+      <w:r>
+        <w:rPr>
+          <w:u w:val="single"/>
+        </w:rPr>
+        <w:t>vevesilistak/admin</w:t>
+      </w:r>
+      <w:r>
+        <w:rPr>
+          <w:u w:val="single"/>
+        </w:rPr>
+        <w:t>)</w:t>
+      </w:r>
+      <w:r>
+        <w:t xml:space="preserve"> </w:t>
+      </w:r>
+      <w:r>
+        <w:br/>
+      </w:r>
+      <w:r>
         <w:lastRenderedPageBreak/>
-        <w:t>összes alkategória átlag árának havi váltakozása</w:t>
-      </w:r>
-      <w:r>
-        <w:br/>
-      </w:r>
-      <w:r>
-        <w:rPr>
-          <w:u w:val="single"/>
-        </w:rPr>
-        <w:t>(http://127.0.0.1:8000/api/statisztika/all)</w:t>
+        <w:t>-- Controllere: VevesListaController</w:t>
+      </w:r>
+      <w:r>
+        <w:br/>
+      </w:r>
+    </w:p>
+    <w:p>
+      <w:pPr>
+        <w:pStyle w:val="Listaszerbekezds"/>
+        <w:numPr>
+          <w:ilvl w:val="0"/>
+          <w:numId w:val="1"/>
+        </w:numPr>
+      </w:pPr>
+      <w:r>
+        <w:t>Összes csoport</w:t>
+      </w:r>
+      <w:r>
+        <w:br/>
+      </w:r>
+      <w:r>
+        <w:rPr>
+          <w:u w:val="single"/>
+        </w:rPr>
+        <w:t>(http://127.0.0.1:8000/</w:t>
+      </w:r>
+      <w:r>
+        <w:rPr>
+          <w:u w:val="single"/>
+        </w:rPr>
+        <w:t>csoportok</w:t>
+      </w:r>
+      <w:r>
+        <w:rPr>
+          <w:u w:val="single"/>
+        </w:rPr>
+        <w:t>/admin</w:t>
+      </w:r>
+      <w:r>
+        <w:rPr>
+          <w:u w:val="single"/>
+        </w:rPr>
+        <w:t>)</w:t>
       </w:r>
       <w:r>
         <w:t xml:space="preserve"> </w:t>
@@ -1059,10 +1412,12 @@
         <w:t xml:space="preserve">-- Controllere: </w:t>
       </w:r>
       <w:r>
-        <w:t>VevesObjektumController</w:t>
-      </w:r>
-    </w:p>
-    <w:p/>
+        <w:t>CsoportTagsagController</w:t>
+      </w:r>
+      <w:r>
+        <w:br/>
+      </w:r>
+    </w:p>
     <w:p>
       <w:pPr>
         <w:pStyle w:val="Listaszerbekezds"/>
@@ -1070,194 +1425,52 @@
           <w:ilvl w:val="0"/>
           <w:numId w:val="1"/>
         </w:numPr>
-        <w:rPr>
-          <w:u w:val="single"/>
-        </w:rPr>
-      </w:pPr>
-      <w:r>
-        <w:t>egy alkategória átlag árának havi váltakozása</w:t>
-      </w:r>
-      <w:r>
-        <w:br/>
-      </w:r>
-      <w:r>
-        <w:rPr>
-          <w:u w:val="single"/>
-        </w:rPr>
-        <w:t>(http://127.0.0.1:8000/api/statisztika/id/{id})</w:t>
+      </w:pPr>
+      <w:r>
+        <w:t>Összes felhasználó</w:t>
+      </w:r>
+      <w:r>
+        <w:br/>
+      </w:r>
+      <w:r>
+        <w:rPr>
+          <w:u w:val="single"/>
+        </w:rPr>
+        <w:t>(http://127.0.0.1:8000/</w:t>
+      </w:r>
+      <w:r>
+        <w:rPr>
+          <w:u w:val="single"/>
+        </w:rPr>
+        <w:t>felhasznalo</w:t>
+      </w:r>
+      <w:r>
+        <w:rPr>
+          <w:u w:val="single"/>
+        </w:rPr>
+        <w:t>/admin</w:t>
+      </w:r>
+      <w:r>
+        <w:rPr>
+          <w:u w:val="single"/>
+        </w:rPr>
+        <w:t>)</w:t>
+      </w:r>
+      <w:r>
+        <w:t xml:space="preserve"> </w:t>
       </w:r>
       <w:r>
         <w:br/>
         <w:t xml:space="preserve">-- Controllere: </w:t>
       </w:r>
       <w:r>
-        <w:t>VevesObjektumController</w:t>
-      </w:r>
-    </w:p>
-    <w:p/>
-    <w:p>
-      <w:pPr>
-        <w:pStyle w:val="Listaszerbekezds"/>
-        <w:numPr>
-          <w:ilvl w:val="0"/>
-          <w:numId w:val="1"/>
-        </w:numPr>
-        <w:rPr>
-          <w:u w:val="single"/>
-        </w:rPr>
-      </w:pPr>
-      <w:r>
-        <w:t>összes alkategória jelenlegi átlagára ebben az évben</w:t>
-      </w:r>
-      <w:r>
-        <w:br/>
-      </w:r>
-      <w:r>
-        <w:rPr>
-          <w:u w:val="single"/>
-        </w:rPr>
-        <w:t>(http://127.0.0.1:8000/api/statisztika/ev/{ev})</w:t>
-      </w:r>
-      <w:r>
-        <w:br/>
-        <w:t xml:space="preserve">-- Controllere: </w:t>
-      </w:r>
-      <w:r>
-        <w:t>VevesObjektumController</w:t>
-      </w:r>
-    </w:p>
-    <w:p>
-      <w:pPr>
-        <w:rPr>
-          <w:u w:val="single"/>
-        </w:rPr>
-      </w:pPr>
-    </w:p>
-    <w:p>
-      <w:pPr>
-        <w:pStyle w:val="Listaszerbekezds"/>
-        <w:numPr>
-          <w:ilvl w:val="0"/>
-          <w:numId w:val="1"/>
-        </w:numPr>
-      </w:pPr>
-      <w:r>
-        <w:t>összes kupon</w:t>
-      </w:r>
-      <w:r>
-        <w:br/>
-      </w:r>
-      <w:r>
-        <w:rPr>
-          <w:u w:val="single"/>
-        </w:rPr>
-        <w:t>(http://127.0.0.1:8000/api/kuponok/get)</w:t>
-      </w:r>
-      <w:r>
-        <w:t xml:space="preserve"> </w:t>
-      </w:r>
-      <w:r>
-        <w:br/>
-        <w:t>-- Controllere: KuponController</w:t>
-      </w:r>
-    </w:p>
-    <w:p/>
-    <w:p>
-      <w:pPr>
-        <w:pStyle w:val="Listaszerbekezds"/>
-        <w:numPr>
-          <w:ilvl w:val="0"/>
-          <w:numId w:val="1"/>
-        </w:numPr>
-      </w:pPr>
-      <w:r>
-        <w:t>felhasználó nyilvános adatai</w:t>
-      </w:r>
-      <w:r>
-        <w:br/>
-      </w:r>
-      <w:r>
-        <w:rPr>
-          <w:u w:val="single"/>
-        </w:rPr>
-        <w:t>(http://127.0.0.1:8000/api/felhasznalo)</w:t>
-      </w:r>
-      <w:r>
-        <w:rPr>
-          <w:u w:val="single"/>
-        </w:rPr>
-        <w:br/>
-      </w:r>
-      <w:r>
-        <w:t>bearer: session token</w:t>
-      </w:r>
-      <w:r>
-        <w:br/>
-        <w:t>-- Controllere: UserController</w:t>
-      </w:r>
-    </w:p>
-    <w:p/>
-    <w:p>
-      <w:pPr>
-        <w:pStyle w:val="Listaszerbekezds"/>
-        <w:numPr>
-          <w:ilvl w:val="0"/>
-          <w:numId w:val="1"/>
-        </w:numPr>
-      </w:pPr>
-      <w:r>
-        <w:t>csoport felhasználoi</w:t>
-      </w:r>
-      <w:r>
-        <w:br/>
-      </w:r>
-      <w:r>
-        <w:rPr>
-          <w:u w:val="single"/>
-        </w:rPr>
-        <w:t>(http://127.0.0.1:8000/api/csoport/{id}/felhasznalok)</w:t>
-      </w:r>
-      <w:r>
-        <w:br/>
-        <w:t>bearer: session token</w:t>
-      </w:r>
-      <w:r>
-        <w:br/>
-        <w:t>-- Controllere: CsoportTagsagController</w:t>
-      </w:r>
-    </w:p>
-    <w:p/>
-    <w:p>
-      <w:pPr>
-        <w:pStyle w:val="Listaszerbekezds"/>
-        <w:numPr>
-          <w:ilvl w:val="0"/>
-          <w:numId w:val="1"/>
-        </w:numPr>
-      </w:pPr>
-      <w:r>
-        <w:t>összes kitöltött ürlap</w:t>
-      </w:r>
-      <w:r>
-        <w:br/>
-      </w:r>
-      <w:r>
-        <w:rPr>
-          <w:u w:val="single"/>
-        </w:rPr>
-        <w:t>(http://127.0.0.1:8000/api/contact)</w:t>
-      </w:r>
-      <w:r>
-        <w:br/>
-        <w:t>bearer: session token (csak nagyobb mint 1 jogosultsagu szintu tud)</w:t>
-      </w:r>
-      <w:r>
-        <w:t xml:space="preserve"> </w:t>
-      </w:r>
-      <w:r>
-        <w:br/>
-        <w:t>-- Controllere: ContactController</w:t>
-      </w:r>
+        <w:t>UserController</w:t>
+      </w:r>
+    </w:p>
+    <w:p>
+      <w:pPr>
+        <w:pStyle w:val="Listaszerbekezds"/>
+      </w:pPr>
     </w:p>
     <w:p/>
     <w:p>
@@ -1318,9 +1531,6 @@
       </w:r>
       <w:r>
         <w:br/>
-      </w:r>
-      <w:r>
-        <w:lastRenderedPageBreak/>
         <w:t>"password":"", ##Muszály</w:t>
       </w:r>
       <w:r>
@@ -1575,7 +1785,6 @@
         </w:numPr>
       </w:pPr>
       <w:r>
-        <w:lastRenderedPageBreak/>
         <w:t>kupon létrehozása</w:t>
       </w:r>
       <w:r>
@@ -1849,167 +2058,168 @@
       </w:r>
       <w:r>
         <w:br/>
+        <w:t>{</w:t>
+      </w:r>
+      <w:r>
+        <w:br/>
+        <w:t>"felhasznalo_id_valtoztatni":"",</w:t>
+      </w:r>
+      <w:r>
+        <w:t xml:space="preserve"> ##szám, létezö felhasználó id</w:t>
+      </w:r>
+      <w:r>
+        <w:br/>
+        <w:t>"nev":"",</w:t>
+      </w:r>
+      <w:r>
+        <w:t xml:space="preserve">  ##szöveg, 1 minimum hossz</w:t>
+      </w:r>
+      <w:r>
+        <w:br/>
+        <w:t>"becenev":"",</w:t>
+      </w:r>
+      <w:r>
+        <w:t xml:space="preserve"> ##szöveg, lehet üres</w:t>
+      </w:r>
+      <w:r>
+        <w:br/>
+        <w:t>"profilkep_url":"",</w:t>
+      </w:r>
+      <w:r>
+        <w:t xml:space="preserve"> ##szöveg, 1 minimum hossz</w:t>
+      </w:r>
+      <w:r>
+        <w:br/>
+        <w:t>"kuponok":"",</w:t>
+      </w:r>
+      <w:r>
+        <w:t xml:space="preserve"> ##szám, 1 vagy 0</w:t>
+      </w:r>
+      <w:r>
+        <w:br/>
+        <w:t>"termekArKovetes":"",</w:t>
+      </w:r>
+      <w:r>
+        <w:t xml:space="preserve"> ##szám, 1 vagy 0</w:t>
+      </w:r>
+      <w:r>
+        <w:br/>
+        <w:t>"brokerArKovetes":""</w:t>
+      </w:r>
+      <w:r>
+        <w:t>, ##szám, 1 vagy 0</w:t>
+      </w:r>
+      <w:r>
+        <w:br/>
+        <w:t>'jogosultsag_szint':”” ##szám, minimum 0</w:t>
+      </w:r>
+      <w:r>
+        <w:br/>
+        <w:t>}</w:t>
+      </w:r>
+      <w:r>
+        <w:br/>
+        <w:t>-- Controllere: UserController</w:t>
+      </w:r>
+    </w:p>
+    <w:p>
+      <w:pPr>
+        <w:pStyle w:val="Listaszerbekezds"/>
+      </w:pPr>
+    </w:p>
+    <w:p>
+      <w:pPr>
+        <w:pStyle w:val="Listaszerbekezds"/>
+        <w:numPr>
+          <w:ilvl w:val="0"/>
+          <w:numId w:val="3"/>
+        </w:numPr>
+      </w:pPr>
+      <w:r>
+        <w:t>csoport módosítása</w:t>
+      </w:r>
+      <w:r>
+        <w:br/>
+      </w:r>
+      <w:r>
+        <w:rPr>
+          <w:u w:val="single"/>
+        </w:rPr>
+        <w:t>(http://127.0.0.1:8000/api/csoport/modositas/{csoportId})</w:t>
+      </w:r>
+      <w:r>
+        <w:rPr>
+          <w:u w:val="single"/>
+        </w:rPr>
+        <w:br/>
+      </w:r>
+      <w:r>
+        <w:t>bearer: session token (csak saját csoportot tudsz ezzel változtatni)</w:t>
+      </w:r>
+      <w:r>
+        <w:br/>
+        <w:t>{</w:t>
+      </w:r>
+      <w:r>
+        <w:br/>
+        <w:t>"megnevezes":"",</w:t>
+      </w:r>
+      <w:r>
+        <w:t xml:space="preserve"> ##szöveg, 1 minimum hossz</w:t>
+      </w:r>
+      <w:r>
+        <w:br/>
+        <w:t>"csoport_tipus_id":"",</w:t>
+      </w:r>
+      <w:r>
+        <w:t xml:space="preserve"> ##szám, létezö csoport tipus id</w:t>
+      </w:r>
+      <w:r>
+        <w:br/>
+      </w:r>
+      <w:r>
+        <w:t>"keszito_felhasznalo_id":""</w:t>
+      </w:r>
+      <w:r>
+        <w:t xml:space="preserve"> ##szám, létezö felhasználo id</w:t>
+      </w:r>
+      <w:r>
+        <w:br/>
+        <w:t>}</w:t>
+      </w:r>
+      <w:r>
+        <w:br/>
+        <w:t>-- Controllere: CsoportokController</w:t>
+      </w:r>
+    </w:p>
+    <w:p/>
+    <w:p>
+      <w:pPr>
+        <w:pStyle w:val="Listaszerbekezds"/>
+        <w:numPr>
+          <w:ilvl w:val="0"/>
+          <w:numId w:val="3"/>
+        </w:numPr>
+      </w:pPr>
+      <w:r>
+        <w:t>csoport tagság modositása</w:t>
+      </w:r>
+      <w:r>
+        <w:br/>
+      </w:r>
+      <w:r>
+        <w:rPr>
+          <w:u w:val="single"/>
+        </w:rPr>
+        <w:t>(http://127.0.0.1:8000/api/csoportTagsag/modositas/{csoportId})</w:t>
+      </w:r>
+      <w:r>
+        <w:br/>
+        <w:t xml:space="preserve">bearer: session token (mást változtatni csak saját csoporton belül tudsz, becenevet bármilyen </w:t>
       </w:r>
       <w:r>
         <w:lastRenderedPageBreak/>
-        <w:t>{</w:t>
-      </w:r>
-      <w:r>
-        <w:br/>
-        <w:t>"felhasznalo_id_valtoztatni":"",</w:t>
-      </w:r>
-      <w:r>
-        <w:t xml:space="preserve"> ##szám, létezö felhasználó id</w:t>
-      </w:r>
-      <w:r>
-        <w:br/>
-        <w:t>"nev":"",</w:t>
-      </w:r>
-      <w:r>
-        <w:t xml:space="preserve">  ##szöveg, 1 minimum hossz</w:t>
-      </w:r>
-      <w:r>
-        <w:br/>
-        <w:t>"becenev":"",</w:t>
-      </w:r>
-      <w:r>
-        <w:t xml:space="preserve"> ##szöveg, lehet üres</w:t>
-      </w:r>
-      <w:r>
-        <w:br/>
-        <w:t>"profilkep_url":"",</w:t>
-      </w:r>
-      <w:r>
-        <w:t xml:space="preserve"> ##szöveg, 1 minimum hossz</w:t>
-      </w:r>
-      <w:r>
-        <w:br/>
-        <w:t>"kuponok":"",</w:t>
-      </w:r>
-      <w:r>
-        <w:t xml:space="preserve"> ##szám, 1 vagy 0</w:t>
-      </w:r>
-      <w:r>
-        <w:br/>
-        <w:t>"termekArKovetes":"",</w:t>
-      </w:r>
-      <w:r>
-        <w:t xml:space="preserve"> ##szám, 1 vagy 0</w:t>
-      </w:r>
-      <w:r>
-        <w:br/>
-        <w:t>"brokerArKovetes":""</w:t>
-      </w:r>
-      <w:r>
-        <w:t>, ##szám, 1 vagy 0</w:t>
-      </w:r>
-      <w:r>
-        <w:br/>
-        <w:t>'jogosultsag_szint':”” ##szám, minimum 0</w:t>
-      </w:r>
-      <w:r>
-        <w:br/>
-        <w:t>}</w:t>
-      </w:r>
-      <w:r>
-        <w:br/>
-        <w:t>-- Controllere: UserController</w:t>
-      </w:r>
-    </w:p>
-    <w:p>
-      <w:pPr>
-        <w:pStyle w:val="Listaszerbekezds"/>
-      </w:pPr>
-    </w:p>
-    <w:p>
-      <w:pPr>
-        <w:pStyle w:val="Listaszerbekezds"/>
-        <w:numPr>
-          <w:ilvl w:val="0"/>
-          <w:numId w:val="3"/>
-        </w:numPr>
-      </w:pPr>
-      <w:r>
-        <w:t>csoport módosítása</w:t>
-      </w:r>
-      <w:r>
-        <w:br/>
-      </w:r>
-      <w:r>
-        <w:rPr>
-          <w:u w:val="single"/>
-        </w:rPr>
-        <w:t>(http://127.0.0.1:8000/api/csoport/modositas/{csoportId})</w:t>
-      </w:r>
-      <w:r>
-        <w:rPr>
-          <w:u w:val="single"/>
-        </w:rPr>
-        <w:br/>
-      </w:r>
-      <w:r>
-        <w:t>bearer: session token (csak saját csoportot tudsz ezzel változtatni)</w:t>
-      </w:r>
-      <w:r>
-        <w:br/>
-        <w:t>{</w:t>
-      </w:r>
-      <w:r>
-        <w:br/>
-        <w:t>"megnevezes":"",</w:t>
-      </w:r>
-      <w:r>
-        <w:t xml:space="preserve"> ##szöveg, 1 minimum hossz</w:t>
-      </w:r>
-      <w:r>
-        <w:br/>
-        <w:t>"csoport_tipus_id":"",</w:t>
-      </w:r>
-      <w:r>
-        <w:t xml:space="preserve"> ##szám, létezö csoport tipus id</w:t>
-      </w:r>
-      <w:r>
-        <w:br/>
-      </w:r>
-      <w:r>
-        <w:t>"keszito_felhasznalo_id":""</w:t>
-      </w:r>
-      <w:r>
-        <w:t xml:space="preserve"> ##szám, létezö felhasználo id</w:t>
-      </w:r>
-      <w:r>
-        <w:br/>
-        <w:t>}</w:t>
-      </w:r>
-      <w:r>
-        <w:br/>
-        <w:t>-- Controllere: CsoportokController</w:t>
-      </w:r>
-    </w:p>
-    <w:p/>
-    <w:p>
-      <w:pPr>
-        <w:pStyle w:val="Listaszerbekezds"/>
-        <w:numPr>
-          <w:ilvl w:val="0"/>
-          <w:numId w:val="3"/>
-        </w:numPr>
-      </w:pPr>
-      <w:r>
-        <w:t>csoport tagság modositása</w:t>
-      </w:r>
-      <w:r>
-        <w:br/>
-      </w:r>
-      <w:r>
-        <w:rPr>
-          <w:u w:val="single"/>
-        </w:rPr>
-        <w:t>(http://127.0.0.1:8000/api/csoportTagsag/modositas/{csoportId})</w:t>
-      </w:r>
-      <w:r>
-        <w:br/>
-        <w:t>bearer: session token (mást változtatni csak saját csoporton belül tudsz, becenevet bármilyen csoportba amibe vagy)</w:t>
+        <w:t>csoportba amibe vagy)</w:t>
       </w:r>
       <w:r>
         <w:br/>
@@ -2112,9 +2322,6 @@
       </w:r>
       <w:r>
         <w:br/>
-      </w:r>
-      <w:r>
-        <w:lastRenderedPageBreak/>
         <w:t>}</w:t>
       </w:r>
       <w:r>
@@ -2375,7 +2582,6 @@
         </w:numPr>
       </w:pPr>
       <w:r>
-        <w:lastRenderedPageBreak/>
         <w:t>csoport tagság törlése</w:t>
       </w:r>
       <w:r>
@@ -4504,6 +4710,29 @@
       <w:szCs w:val="56"/>
     </w:rPr>
   </w:style>
+  <w:style w:type="character" w:styleId="Hiperhivatkozs">
+    <w:name w:val="Hyperlink"/>
+    <w:basedOn w:val="Bekezdsalapbettpusa"/>
+    <w:uiPriority w:val="99"/>
+    <w:unhideWhenUsed/>
+    <w:rsid w:val="004A0C3C"/>
+    <w:rPr>
+      <w:color w:val="0563C1" w:themeColor="hyperlink"/>
+      <w:u w:val="single"/>
+    </w:rPr>
+  </w:style>
+  <w:style w:type="character" w:styleId="Feloldatlanmegemlts">
+    <w:name w:val="Unresolved Mention"/>
+    <w:basedOn w:val="Bekezdsalapbettpusa"/>
+    <w:uiPriority w:val="99"/>
+    <w:semiHidden/>
+    <w:unhideWhenUsed/>
+    <w:rsid w:val="004A0C3C"/>
+    <w:rPr>
+      <w:color w:val="605E5C"/>
+      <w:shd w:val="clear" w:color="auto" w:fill="E1DFDD"/>
+    </w:rPr>
+  </w:style>
 </w:styles>
 </file>
 

</xml_diff>